<commit_message>
Remove recommendations from QA report
</commit_message>
<xml_diff>
--- a/docs/Informe_Consolidado_QA_EFAC.docx
+++ b/docs/Informe_Consolidado_QA_EFAC.docx
@@ -247,7 +247,7 @@
               <w:rPr>
                 <w:b w:val="0"/>
               </w:rPr>
-              <w:t>main / 69ab0f4</w:t>
+              <w:t>main / 3ce426e</w:t>
             </w:r>
           </w:p>
         </w:tc>
@@ -286,7 +286,7 @@
               <w:rPr>
                 <w:b w:val="0"/>
               </w:rPr>
-              <w:t>2026-05-11 12:13</w:t>
+              <w:t>2026-05-11 12:42</w:t>
             </w:r>
           </w:p>
         </w:tc>
@@ -5105,54 +5105,6 @@
     </w:p>
     <w:p>
       <w:pPr>
-        <w:pStyle w:val="Heading2"/>
-      </w:pPr>
-      <w:r>
-        <w:t>8.3 Recomendaciones</w:t>
-      </w:r>
-    </w:p>
-    <w:p>
-      <w:pPr>
-        <w:pStyle w:val="ListBullet"/>
-      </w:pPr>
-      <w:r>
-        <w:t>Conservar el PDF, el README y la matriz como paquete de entrega.</w:t>
-      </w:r>
-    </w:p>
-    <w:p>
-      <w:pPr>
-        <w:pStyle w:val="ListBullet"/>
-      </w:pPr>
-      <w:r>
-        <w:t>Ejecutar run-qa-tests.bat antes de cada entrega formal.</w:t>
-      </w:r>
-    </w:p>
-    <w:p>
-      <w:pPr>
-        <w:pStyle w:val="ListBullet"/>
-      </w:pPr>
-      <w:r>
-        <w:t>Guardar capturas finales en test-assets/evidence/screenshots si el docente las solicita.</w:t>
-      </w:r>
-    </w:p>
-    <w:p>
-      <w:pPr>
-        <w:pStyle w:val="ListBullet"/>
-      </w:pPr>
-      <w:r>
-        <w:t>Agregar reportes HTML en una etapa futura si se requiere lectura mas amigable que TRX.</w:t>
-      </w:r>
-    </w:p>
-    <w:p>
-      <w:pPr>
-        <w:pStyle w:val="ListBullet"/>
-      </w:pPr>
-      <w:r>
-        <w:t>Separar frontend y backend si se desea publicar una version web en Vercel.</w:t>
-      </w:r>
-    </w:p>
-    <w:p>
-      <w:pPr>
         <w:pStyle w:val="Heading1"/>
       </w:pPr>
       <w:r>

</xml_diff>